<commit_message>
test: Remove testes e exclui queries da cobertura
Remove os testes extensivos das consultas `CodafDeclaracaoQueries` e `RelatoriosInscritosQueries`, alinhando a estratégia para não medir cobertura em classes estáticas de SQL por meio de `[ExcludeFromCodeCoverage]`. Também atualiza o template binário `Template_Lauda_Completa.docx`.
</commit_message>
<xml_diff>
--- a/SME.ConectaFormacao.Infra.Dados/Templates/Template_Lauda_Completa.docx
+++ b/SME.ConectaFormacao.Infra.Dados/Templates/Template_Lauda_Completa.docx
@@ -2,71 +2,6 @@
 <file path=word/document.xml><?xml version="1.0" encoding="utf-8"?>
 <w:document xmlns:wpc="http://schemas.microsoft.com/office/word/2010/wordprocessingCanvas" xmlns:mo="http://schemas.microsoft.com/office/mac/office/2008/main" xmlns:mc="http://schemas.openxmlformats.org/markup-compatibility/2006" xmlns:mv="urn:schemas-microsoft-com:mac:vml" xmlns:o="urn:schemas-microsoft-com:office:office" xmlns:r="http://schemas.openxmlformats.org/officeDocument/2006/relationships" xmlns:m="http://schemas.openxmlformats.org/officeDocument/2006/math" xmlns:v="urn:schemas-microsoft-com:vml" xmlns:wp14="http://schemas.microsoft.com/office/word/2010/wordprocessingDrawing" xmlns:wp="http://schemas.openxmlformats.org/drawingml/2006/wordprocessingDrawing" xmlns:w10="urn:schemas-microsoft-com:office:word" xmlns:w="http://schemas.openxmlformats.org/wordprocessingml/2006/main" xmlns:w14="http://schemas.microsoft.com/office/word/2010/wordml" xmlns:wpg="http://schemas.microsoft.com/office/word/2010/wordprocessingGroup" xmlns:wpi="http://schemas.microsoft.com/office/word/2010/wordprocessingInk" xmlns:wne="http://schemas.microsoft.com/office/word/2006/wordml" xmlns:wps="http://schemas.microsoft.com/office/word/2010/wordprocessingShape" mc:Ignorable="w14 wp14">
   <w:body>
-    <w:p>
-      <w:pPr>
-        <w:spacing w:after="40"/>
-        <w:jc w:val="center"/>
-      </w:pPr>
-      <w:r>
-        <w:rPr>
-          <w:rFonts w:ascii="Courier New" w:hAnsi="Courier New"/>
-          <w:b/>
-          <w:color w:val="42474A"/>
-          <w:sz w:val="30"/>
-        </w:rPr>
-        <w:t>PREFEITURA DA CIDADE DE SÃO PAULO</w:t>
-      </w:r>
-    </w:p>
-    <w:p>
-      <w:pPr>
-        <w:spacing w:after="40"/>
-        <w:jc w:val="center"/>
-      </w:pPr>
-      <w:r>
-        <w:rPr>
-          <w:rFonts w:ascii="Courier New" w:hAnsi="Courier New"/>
-          <w:b/>
-          <w:color w:val="42474A"/>
-          <w:sz w:val="30"/>
-        </w:rPr>
-        <w:t>SECRETARIA MUNICIPAL DE EDUCAÇÃO</w:t>
-      </w:r>
-    </w:p>
-    <w:p>
-      <w:pPr>
-        <w:spacing w:after="40"/>
-        <w:jc w:val="center"/>
-      </w:pPr>
-      <w:r>
-        <w:rPr>
-          <w:rFonts w:ascii="Courier New" w:hAnsi="Courier New"/>
-          <w:b/>
-          <w:color w:val="42474A"/>
-          <w:sz w:val="30"/>
-        </w:rPr>
-        <w:t>PROPOSTA DE FORMAÇÃO</w:t>
-      </w:r>
-    </w:p>
-    <w:p>
-      <w:pPr>
-        <w:spacing w:after="40"/>
-        <w:jc w:val="center"/>
-      </w:pPr>
-      <w:r>
-        <w:rPr>
-          <w:rFonts w:ascii="Courier New" w:hAnsi="Courier New"/>
-          <w:b/>
-          <w:color w:val="42474A"/>
-          <w:sz w:val="30"/>
-        </w:rPr>
-        <w:t>Texto de autoria da área promotora</w:t>
-      </w:r>
-    </w:p>
-    <w:p>
-      <w:pPr>
-        <w:spacing w:after="200"/>
-      </w:pPr>
-    </w:p>
     <w:tbl>
       <w:tblPr>
         <w:tblStyle w:val="TableGrid"/>
@@ -1148,7 +1083,8 @@
       </w:tr>
     </w:tbl>
     <w:sectPr>
-      <w:footerReference w:type="default" r:id="rId9"/>
+      <w:headerReference w:type="default" r:id="rId9"/>
+      <w:footerReference w:type="default" r:id="rId10"/>
       <w:pgSz w:w="11906" w:h="16838"/>
       <w:pgMar w:top="720" w:right="720" w:bottom="720" w:left="720" w:header="720" w:footer="720" w:gutter="0"/>
       <w:cols w:space="720"/>
@@ -1160,25 +1096,134 @@
 
 <file path=word/footer1.xml><?xml version="1.0" encoding="utf-8"?>
 <w:ftr xmlns:m="http://schemas.openxmlformats.org/officeDocument/2006/math" xmlns:mc="http://schemas.openxmlformats.org/markup-compatibility/2006" xmlns:mo="http://schemas.microsoft.com/office/mac/office/2008/main" xmlns:mv="urn:schemas-microsoft-com:mac:vml" xmlns:o="urn:schemas-microsoft-com:office:office" xmlns:r="http://schemas.openxmlformats.org/officeDocument/2006/relationships" xmlns:v="urn:schemas-microsoft-com:vml" xmlns:w10="urn:schemas-microsoft-com:office:word" xmlns:w14="http://schemas.microsoft.com/office/word/2010/wordml" xmlns:w="http://schemas.openxmlformats.org/wordprocessingml/2006/main" xmlns:wne="http://schemas.microsoft.com/office/word/2006/wordml" xmlns:wp14="http://schemas.microsoft.com/office/word/2010/wordprocessingDrawing" xmlns:wp="http://schemas.openxmlformats.org/drawingml/2006/wordprocessingDrawing" xmlns:wpc="http://schemas.microsoft.com/office/word/2010/wordprocessingCanvas" xmlns:wpg="http://schemas.microsoft.com/office/word/2010/wordprocessingGroup" xmlns:wpi="http://schemas.microsoft.com/office/word/2010/wordprocessingInk" xmlns:wps="http://schemas.microsoft.com/office/word/2010/wordprocessingShape" mc:Ignorable="w14 wp14">
+  <w:tbl>
+    <w:tblPr>
+      <w:tblW w:type="auto" w:w="0"/>
+      <w:tblLook w:firstColumn="1" w:firstRow="1" w:lastColumn="0" w:lastRow="0" w:noHBand="0" w:noVBand="1" w:val="04A0"/>
+    </w:tblPr>
+    <w:tblGrid>
+      <w:gridCol w:w="5233"/>
+      <w:gridCol w:w="5233"/>
+    </w:tblGrid>
+    <w:tr>
+      <w:tc>
+        <w:tcPr>
+          <w:tcW w:type="dxa" w:w="5233"/>
+        </w:tcPr>
+        <w:p>
+          <w:pPr>
+            <w:jc w:val="left"/>
+          </w:pPr>
+          <w:r>
+            <w:rPr>
+              <w:rFonts w:ascii="Courier New" w:hAnsi="Courier New"/>
+              <w:b w:val="0"/>
+              <w:color w:val="42474A"/>
+              <w:sz w:val="20"/>
+            </w:rPr>
+            <w:t>Relatório de Proposta - Lauda completa</w:t>
+          </w:r>
+        </w:p>
+      </w:tc>
+      <w:tc>
+        <w:tcPr>
+          <w:tcW w:type="dxa" w:w="5233"/>
+        </w:tcPr>
+        <w:p>
+          <w:pPr>
+            <w:jc w:val="right"/>
+          </w:pPr>
+          <w:r>
+            <w:rPr>
+              <w:rFonts w:ascii="Courier New" w:hAnsi="Courier New"/>
+              <w:b w:val="0"/>
+              <w:color w:val="42474A"/>
+              <w:sz w:val="20"/>
+            </w:rPr>
+            <w:fldChar w:fldCharType="begin"/>
+            <w:instrText xml:space="preserve"> PAGE </w:instrText>
+            <w:fldChar w:fldCharType="separate"/>
+            <w:t>1</w:t>
+            <w:fldChar w:fldCharType="end"/>
+          </w:r>
+          <w:r>
+            <w:rPr>
+              <w:rFonts w:ascii="Courier New" w:hAnsi="Courier New"/>
+              <w:b w:val="0"/>
+              <w:color w:val="42474A"/>
+              <w:sz w:val="20"/>
+            </w:rPr>
+            <w:t xml:space="preserve"> / </w:t>
+          </w:r>
+          <w:r>
+            <w:rPr>
+              <w:rFonts w:ascii="Courier New" w:hAnsi="Courier New"/>
+              <w:b w:val="0"/>
+              <w:color w:val="42474A"/>
+              <w:sz w:val="20"/>
+            </w:rPr>
+            <w:fldChar w:fldCharType="begin"/>
+            <w:instrText xml:space="preserve"> NUMPAGES </w:instrText>
+            <w:fldChar w:fldCharType="separate"/>
+            <w:t>3</w:t>
+            <w:fldChar w:fldCharType="end"/>
+          </w:r>
+        </w:p>
+      </w:tc>
+    </w:tr>
+  </w:tbl>
+</w:ftr>
+</file>
+
+<file path=word/header1.xml><?xml version="1.0" encoding="utf-8"?>
+<w:hdr xmlns:m="http://schemas.openxmlformats.org/officeDocument/2006/math" xmlns:mc="http://schemas.openxmlformats.org/markup-compatibility/2006" xmlns:mo="http://schemas.microsoft.com/office/mac/office/2008/main" xmlns:mv="urn:schemas-microsoft-com:mac:vml" xmlns:o="urn:schemas-microsoft-com:office:office" xmlns:r="http://schemas.openxmlformats.org/officeDocument/2006/relationships" xmlns:v="urn:schemas-microsoft-com:vml" xmlns:w10="urn:schemas-microsoft-com:office:word" xmlns:w14="http://schemas.microsoft.com/office/word/2010/wordml" xmlns:w="http://schemas.openxmlformats.org/wordprocessingml/2006/main" xmlns:wne="http://schemas.microsoft.com/office/word/2006/wordml" xmlns:wp14="http://schemas.microsoft.com/office/word/2010/wordprocessingDrawing" xmlns:wp="http://schemas.openxmlformats.org/drawingml/2006/wordprocessingDrawing" xmlns:wpc="http://schemas.microsoft.com/office/word/2010/wordprocessingCanvas" xmlns:wpg="http://schemas.microsoft.com/office/word/2010/wordprocessingGroup" xmlns:wpi="http://schemas.microsoft.com/office/word/2010/wordprocessingInk" xmlns:wps="http://schemas.microsoft.com/office/word/2010/wordprocessingShape" mc:Ignorable="w14 wp14">
   <w:p>
     <w:pPr>
-      <w:pStyle w:val="Footer"/>
-      <w:jc w:val="right"/>
+      <w:pStyle w:val="Header"/>
+      <w:spacing w:after="40"/>
+      <w:jc w:val="center"/>
     </w:pPr>
     <w:r>
       <w:rPr>
         <w:rFonts w:ascii="Courier New" w:hAnsi="Courier New"/>
-        <w:sz w:val="20"/>
-      </w:rPr>
-      <w:t xml:space="preserve">Página </w:t>
-      <w:fldChar w:fldCharType="begin"/>
-      <w:instrText xml:space="preserve"> PAGE </w:instrText>
-      <w:fldChar w:fldCharType="separate"/>
-      <w:t>1</w:t>
-      <w:fldChar w:fldCharType="end"/>
+        <w:b/>
+        <w:color w:val="42474A"/>
+        <w:sz w:val="30"/>
+      </w:rPr>
+      <w:t>PREFEITURA DA CIDADE DE SÃO PAULO</w:t>
+      <w:br/>
+    </w:r>
+    <w:r>
+      <w:rPr>
+        <w:rFonts w:ascii="Courier New" w:hAnsi="Courier New"/>
+        <w:b/>
+        <w:color w:val="42474A"/>
+        <w:sz w:val="30"/>
+      </w:rPr>
+      <w:t>SECRETARIA MUNICIPAL DE EDUCAÇÃO</w:t>
+      <w:br/>
+    </w:r>
+    <w:r>
+      <w:rPr>
+        <w:rFonts w:ascii="Courier New" w:hAnsi="Courier New"/>
+        <w:b/>
+        <w:color w:val="42474A"/>
+        <w:sz w:val="30"/>
+      </w:rPr>
+      <w:t>PROPOSTA DE FORMAÇÃO</w:t>
+      <w:br/>
+    </w:r>
+    <w:r>
+      <w:rPr>
+        <w:rFonts w:ascii="Courier New" w:hAnsi="Courier New"/>
+        <w:b/>
+        <w:color w:val="42474A"/>
+        <w:sz w:val="30"/>
+      </w:rPr>
+      <w:t>Texto de autoria da área promotora</w:t>
     </w:r>
   </w:p>
-</w:ftr>
+</w:hdr>
 </file>
 
 <file path=word/numbering.xml><?xml version="1.0" encoding="utf-8"?>

</xml_diff>

<commit_message>
fix: Corrige ordenacao e integridade do DOCX
Ajusta a ordenacao das turmas no cronograma usando comparacao pt-BR com ordenacao numerica, evitando sequencias lexicograficas incorretas (ex.: Turma 10 antes da Turma 2). No gerador da lauda, garante que TableCell finalize com Paragraph para prevenir corrompimento OpenXML ao remover paragrafos de placeholders. Inclui atualizacao do template Template_Lauda_Completa.docx para refletir o ajuste da geracao.
</commit_message>
<xml_diff>
--- a/SME.ConectaFormacao.Infra.Dados/Templates/Template_Lauda_Completa.docx
+++ b/SME.ConectaFormacao.Infra.Dados/Templates/Template_Lauda_Completa.docx
@@ -45,6 +45,25 @@
           </w:p>
         </w:tc>
       </w:tr>
+    </w:tbl>
+    <w:p>
+      <w:pPr>
+        <w:spacing w:after="0" w:line="20" w:lineRule="exact"/>
+        <w:rPr>
+          <w:rFonts w:ascii="Consolas" w:hAnsi="Consolas"/>
+          <w:lang w:val="pt-BR"/>
+        </w:rPr>
+      </w:pPr>
+    </w:p>
+    <w:tbl>
+      <w:tblPr>
+        <w:tblStyle w:val="Tabelacomgrade"/>
+        <w:tblW w:w="0" w:type="auto"/>
+        <w:tblLook w:val="04A0" w:firstRow="1" w:lastRow="0" w:firstColumn="1" w:lastColumn="0" w:noHBand="0" w:noVBand="1"/>
+      </w:tblPr>
+      <w:tblGrid>
+        <w:gridCol w:w="10466"/>
+      </w:tblGrid>
       <w:tr>
         <w:tc>
           <w:tcPr>
@@ -79,6 +98,25 @@
           </w:p>
         </w:tc>
       </w:tr>
+    </w:tbl>
+    <w:p>
+      <w:pPr>
+        <w:spacing w:after="0" w:line="20" w:lineRule="exact"/>
+        <w:rPr>
+          <w:rFonts w:ascii="Consolas" w:hAnsi="Consolas"/>
+          <w:lang w:val="pt-BR"/>
+        </w:rPr>
+      </w:pPr>
+    </w:p>
+    <w:tbl>
+      <w:tblPr>
+        <w:tblStyle w:val="Tabelacomgrade"/>
+        <w:tblW w:w="0" w:type="auto"/>
+        <w:tblLook w:val="04A0" w:firstRow="1" w:lastRow="0" w:firstColumn="1" w:lastColumn="0" w:noHBand="0" w:noVBand="1"/>
+      </w:tblPr>
+      <w:tblGrid>
+        <w:gridCol w:w="10466"/>
+      </w:tblGrid>
       <w:tr>
         <w:tc>
           <w:tcPr>
@@ -113,6 +151,25 @@
           </w:p>
         </w:tc>
       </w:tr>
+    </w:tbl>
+    <w:p>
+      <w:pPr>
+        <w:spacing w:after="0" w:line="20" w:lineRule="exact"/>
+        <w:rPr>
+          <w:rFonts w:ascii="Consolas" w:hAnsi="Consolas"/>
+          <w:lang w:val="pt-BR"/>
+        </w:rPr>
+      </w:pPr>
+    </w:p>
+    <w:tbl>
+      <w:tblPr>
+        <w:tblStyle w:val="Tabelacomgrade"/>
+        <w:tblW w:w="0" w:type="auto"/>
+        <w:tblLook w:val="04A0" w:firstRow="1" w:lastRow="0" w:firstColumn="1" w:lastColumn="0" w:noHBand="0" w:noVBand="1"/>
+      </w:tblPr>
+      <w:tblGrid>
+        <w:gridCol w:w="10466"/>
+      </w:tblGrid>
       <w:tr>
         <w:tc>
           <w:tcPr>
@@ -122,9 +179,7 @@
             <w:pPr>
               <w:rPr>
                 <w:rFonts w:ascii="Consolas" w:hAnsi="Consolas"/>
-                <w:b/>
-                <w:color w:val="42474A"/>
-                <w:sz w:val="21"/>
+                <w:lang w:val="pt-BR"/>
               </w:rPr>
             </w:pPr>
             <w:r>
@@ -133,27 +188,41 @@
                 <w:b/>
                 <w:color w:val="42474A"/>
                 <w:sz w:val="21"/>
+                <w:lang w:val="pt-BR"/>
               </w:rPr>
               <w:t xml:space="preserve">ÁREA PROMOTORA: </w:t>
             </w:r>
-          </w:p>
-          <w:p>
-            <w:pPr>
-              <w:rPr>
-                <w:rFonts w:ascii="Consolas" w:hAnsi="Consolas"/>
-              </w:rPr>
-            </w:pPr>
             <w:r>
               <w:rPr>
                 <w:rFonts w:ascii="Consolas" w:hAnsi="Consolas"/>
                 <w:color w:val="42474A"/>
                 <w:sz w:val="21"/>
+                <w:lang w:val="pt-BR"/>
               </w:rPr>
               <w:t>{{AREA_PROMOTORA}}</w:t>
             </w:r>
           </w:p>
         </w:tc>
       </w:tr>
+    </w:tbl>
+    <w:p>
+      <w:pPr>
+        <w:spacing w:after="0" w:line="20" w:lineRule="exact"/>
+        <w:rPr>
+          <w:rFonts w:ascii="Consolas" w:hAnsi="Consolas"/>
+          <w:lang w:val="pt-BR"/>
+        </w:rPr>
+      </w:pPr>
+    </w:p>
+    <w:tbl>
+      <w:tblPr>
+        <w:tblStyle w:val="Tabelacomgrade"/>
+        <w:tblW w:w="0" w:type="auto"/>
+        <w:tblLook w:val="04A0" w:firstRow="1" w:lastRow="0" w:firstColumn="1" w:lastColumn="0" w:noHBand="0" w:noVBand="1"/>
+      </w:tblPr>
+      <w:tblGrid>
+        <w:gridCol w:w="10466"/>
+      </w:tblGrid>
       <w:tr>
         <w:tc>
           <w:tcPr>
@@ -163,9 +232,7 @@
             <w:pPr>
               <w:rPr>
                 <w:rFonts w:ascii="Consolas" w:hAnsi="Consolas"/>
-                <w:b/>
-                <w:color w:val="42474A"/>
-                <w:sz w:val="21"/>
+                <w:lang w:val="pt-BR"/>
               </w:rPr>
             </w:pPr>
             <w:r>
@@ -174,27 +241,41 @@
                 <w:b/>
                 <w:color w:val="42474A"/>
                 <w:sz w:val="21"/>
+                <w:lang w:val="pt-BR"/>
               </w:rPr>
               <w:t xml:space="preserve">NOME: </w:t>
             </w:r>
-          </w:p>
-          <w:p>
-            <w:pPr>
-              <w:rPr>
-                <w:rFonts w:ascii="Consolas" w:hAnsi="Consolas"/>
-              </w:rPr>
-            </w:pPr>
             <w:r>
               <w:rPr>
                 <w:rFonts w:ascii="Consolas" w:hAnsi="Consolas"/>
                 <w:color w:val="42474A"/>
                 <w:sz w:val="21"/>
+                <w:lang w:val="pt-BR"/>
               </w:rPr>
               <w:t>{{NOME_FORMACAO}}</w:t>
             </w:r>
           </w:p>
         </w:tc>
       </w:tr>
+    </w:tbl>
+    <w:p>
+      <w:pPr>
+        <w:spacing w:after="0" w:line="20" w:lineRule="exact"/>
+        <w:rPr>
+          <w:rFonts w:ascii="Consolas" w:hAnsi="Consolas"/>
+          <w:lang w:val="pt-BR"/>
+        </w:rPr>
+      </w:pPr>
+    </w:p>
+    <w:tbl>
+      <w:tblPr>
+        <w:tblStyle w:val="Tabelacomgrade"/>
+        <w:tblW w:w="0" w:type="auto"/>
+        <w:tblLook w:val="04A0" w:firstRow="1" w:lastRow="0" w:firstColumn="1" w:lastColumn="0" w:noHBand="0" w:noVBand="1"/>
+      </w:tblPr>
+      <w:tblGrid>
+        <w:gridCol w:w="10466"/>
+      </w:tblGrid>
       <w:tr>
         <w:tc>
           <w:tcPr>
@@ -204,6 +285,7 @@
             <w:pPr>
               <w:rPr>
                 <w:rFonts w:ascii="Consolas" w:hAnsi="Consolas"/>
+                <w:lang w:val="pt-BR"/>
               </w:rPr>
             </w:pPr>
             <w:r>
@@ -212,6 +294,7 @@
                 <w:b/>
                 <w:color w:val="42474A"/>
                 <w:sz w:val="21"/>
+                <w:lang w:val="pt-BR"/>
               </w:rPr>
               <w:t xml:space="preserve">MODALIDADE: </w:t>
             </w:r>
@@ -220,12 +303,32 @@
                 <w:rFonts w:ascii="Consolas" w:hAnsi="Consolas"/>
                 <w:color w:val="42474A"/>
                 <w:sz w:val="21"/>
+                <w:lang w:val="pt-BR"/>
               </w:rPr>
               <w:t>{{MODALIDADE}}</w:t>
             </w:r>
           </w:p>
         </w:tc>
       </w:tr>
+    </w:tbl>
+    <w:p>
+      <w:pPr>
+        <w:spacing w:after="0" w:line="20" w:lineRule="exact"/>
+        <w:rPr>
+          <w:rFonts w:ascii="Consolas" w:hAnsi="Consolas"/>
+          <w:lang w:val="pt-BR"/>
+        </w:rPr>
+      </w:pPr>
+    </w:p>
+    <w:tbl>
+      <w:tblPr>
+        <w:tblStyle w:val="Tabelacomgrade"/>
+        <w:tblW w:w="0" w:type="auto"/>
+        <w:tblLook w:val="04A0" w:firstRow="1" w:lastRow="0" w:firstColumn="1" w:lastColumn="0" w:noHBand="0" w:noVBand="1"/>
+      </w:tblPr>
+      <w:tblGrid>
+        <w:gridCol w:w="10466"/>
+      </w:tblGrid>
       <w:tr>
         <w:tc>
           <w:tcPr>
@@ -260,6 +363,25 @@
           </w:p>
         </w:tc>
       </w:tr>
+    </w:tbl>
+    <w:p>
+      <w:pPr>
+        <w:spacing w:after="0" w:line="20" w:lineRule="exact"/>
+        <w:rPr>
+          <w:rFonts w:ascii="Consolas" w:hAnsi="Consolas"/>
+          <w:lang w:val="pt-BR"/>
+        </w:rPr>
+      </w:pPr>
+    </w:p>
+    <w:tbl>
+      <w:tblPr>
+        <w:tblStyle w:val="Tabelacomgrade"/>
+        <w:tblW w:w="0" w:type="auto"/>
+        <w:tblLook w:val="04A0" w:firstRow="1" w:lastRow="0" w:firstColumn="1" w:lastColumn="0" w:noHBand="0" w:noVBand="1"/>
+      </w:tblPr>
+      <w:tblGrid>
+        <w:gridCol w:w="10466"/>
+      </w:tblGrid>
       <w:tr>
         <w:tc>
           <w:tcPr>
@@ -294,6 +416,25 @@
           </w:p>
         </w:tc>
       </w:tr>
+    </w:tbl>
+    <w:p>
+      <w:pPr>
+        <w:spacing w:after="0" w:line="20" w:lineRule="exact"/>
+        <w:rPr>
+          <w:rFonts w:ascii="Consolas" w:hAnsi="Consolas"/>
+          <w:lang w:val="pt-BR"/>
+        </w:rPr>
+      </w:pPr>
+    </w:p>
+    <w:tbl>
+      <w:tblPr>
+        <w:tblStyle w:val="Tabelacomgrade"/>
+        <w:tblW w:w="0" w:type="auto"/>
+        <w:tblLook w:val="04A0" w:firstRow="1" w:lastRow="0" w:firstColumn="1" w:lastColumn="0" w:noHBand="0" w:noVBand="1"/>
+      </w:tblPr>
+      <w:tblGrid>
+        <w:gridCol w:w="10466"/>
+      </w:tblGrid>
       <w:tr>
         <w:tc>
           <w:tcPr>
@@ -328,6 +469,25 @@
           </w:p>
         </w:tc>
       </w:tr>
+    </w:tbl>
+    <w:p>
+      <w:pPr>
+        <w:spacing w:after="0" w:line="20" w:lineRule="exact"/>
+        <w:rPr>
+          <w:rFonts w:ascii="Consolas" w:hAnsi="Consolas"/>
+          <w:lang w:val="pt-BR"/>
+        </w:rPr>
+      </w:pPr>
+    </w:p>
+    <w:tbl>
+      <w:tblPr>
+        <w:tblStyle w:val="Tabelacomgrade"/>
+        <w:tblW w:w="0" w:type="auto"/>
+        <w:tblLook w:val="04A0" w:firstRow="1" w:lastRow="0" w:firstColumn="1" w:lastColumn="0" w:noHBand="0" w:noVBand="1"/>
+      </w:tblPr>
+      <w:tblGrid>
+        <w:gridCol w:w="10466"/>
+      </w:tblGrid>
       <w:tr>
         <w:tc>
           <w:tcPr>
@@ -362,6 +522,25 @@
           </w:p>
         </w:tc>
       </w:tr>
+    </w:tbl>
+    <w:p>
+      <w:pPr>
+        <w:spacing w:after="0" w:line="20" w:lineRule="exact"/>
+        <w:rPr>
+          <w:rFonts w:ascii="Consolas" w:hAnsi="Consolas"/>
+          <w:lang w:val="pt-BR"/>
+        </w:rPr>
+      </w:pPr>
+    </w:p>
+    <w:tbl>
+      <w:tblPr>
+        <w:tblStyle w:val="Tabelacomgrade"/>
+        <w:tblW w:w="0" w:type="auto"/>
+        <w:tblLook w:val="04A0" w:firstRow="1" w:lastRow="0" w:firstColumn="1" w:lastColumn="0" w:noHBand="0" w:noVBand="1"/>
+      </w:tblPr>
+      <w:tblGrid>
+        <w:gridCol w:w="10466"/>
+      </w:tblGrid>
       <w:tr>
         <w:tc>
           <w:tcPr>
@@ -371,9 +550,7 @@
             <w:pPr>
               <w:rPr>
                 <w:rFonts w:ascii="Consolas" w:hAnsi="Consolas"/>
-                <w:b/>
-                <w:color w:val="42474A"/>
-                <w:sz w:val="21"/>
+                <w:lang w:val="pt-BR"/>
               </w:rPr>
             </w:pPr>
             <w:r>
@@ -382,27 +559,41 @@
                 <w:b/>
                 <w:color w:val="42474A"/>
                 <w:sz w:val="21"/>
+                <w:lang w:val="pt-BR"/>
               </w:rPr>
               <w:t xml:space="preserve">JUSTIFICATIVA: </w:t>
             </w:r>
-          </w:p>
-          <w:p>
-            <w:pPr>
-              <w:rPr>
-                <w:rFonts w:ascii="Consolas" w:hAnsi="Consolas"/>
-              </w:rPr>
-            </w:pPr>
             <w:r>
               <w:rPr>
                 <w:rFonts w:ascii="Consolas" w:hAnsi="Consolas"/>
                 <w:color w:val="42474A"/>
                 <w:sz w:val="21"/>
+                <w:lang w:val="pt-BR"/>
               </w:rPr>
               <w:t>{{JUSTIFICATIVA}}</w:t>
             </w:r>
           </w:p>
         </w:tc>
       </w:tr>
+    </w:tbl>
+    <w:p>
+      <w:pPr>
+        <w:spacing w:after="0" w:line="20" w:lineRule="exact"/>
+        <w:rPr>
+          <w:rFonts w:ascii="Consolas" w:hAnsi="Consolas"/>
+          <w:lang w:val="pt-BR"/>
+        </w:rPr>
+      </w:pPr>
+    </w:p>
+    <w:tbl>
+      <w:tblPr>
+        <w:tblStyle w:val="Tabelacomgrade"/>
+        <w:tblW w:w="0" w:type="auto"/>
+        <w:tblLook w:val="04A0" w:firstRow="1" w:lastRow="0" w:firstColumn="1" w:lastColumn="0" w:noHBand="0" w:noVBand="1"/>
+      </w:tblPr>
+      <w:tblGrid>
+        <w:gridCol w:w="10466"/>
+      </w:tblGrid>
       <w:tr>
         <w:tc>
           <w:tcPr>
@@ -412,9 +603,7 @@
             <w:pPr>
               <w:rPr>
                 <w:rFonts w:ascii="Consolas" w:hAnsi="Consolas"/>
-                <w:b/>
-                <w:color w:val="42474A"/>
-                <w:sz w:val="21"/>
+                <w:lang w:val="pt-BR"/>
               </w:rPr>
             </w:pPr>
             <w:r>
@@ -423,27 +612,41 @@
                 <w:b/>
                 <w:color w:val="42474A"/>
                 <w:sz w:val="21"/>
+                <w:lang w:val="pt-BR"/>
               </w:rPr>
               <w:t xml:space="preserve">OBJETIVOS: </w:t>
             </w:r>
-          </w:p>
-          <w:p>
-            <w:pPr>
-              <w:rPr>
-                <w:rFonts w:ascii="Consolas" w:hAnsi="Consolas"/>
-              </w:rPr>
-            </w:pPr>
             <w:r>
               <w:rPr>
                 <w:rFonts w:ascii="Consolas" w:hAnsi="Consolas"/>
                 <w:color w:val="42474A"/>
                 <w:sz w:val="21"/>
+                <w:lang w:val="pt-BR"/>
               </w:rPr>
               <w:t>{{OBJETIVOS}}</w:t>
             </w:r>
           </w:p>
         </w:tc>
       </w:tr>
+    </w:tbl>
+    <w:p>
+      <w:pPr>
+        <w:spacing w:after="0" w:line="20" w:lineRule="exact"/>
+        <w:rPr>
+          <w:rFonts w:ascii="Consolas" w:hAnsi="Consolas"/>
+          <w:lang w:val="pt-BR"/>
+        </w:rPr>
+      </w:pPr>
+    </w:p>
+    <w:tbl>
+      <w:tblPr>
+        <w:tblStyle w:val="Tabelacomgrade"/>
+        <w:tblW w:w="0" w:type="auto"/>
+        <w:tblLook w:val="04A0" w:firstRow="1" w:lastRow="0" w:firstColumn="1" w:lastColumn="0" w:noHBand="0" w:noVBand="1"/>
+      </w:tblPr>
+      <w:tblGrid>
+        <w:gridCol w:w="10466"/>
+      </w:tblGrid>
       <w:tr>
         <w:tc>
           <w:tcPr>
@@ -453,9 +656,7 @@
             <w:pPr>
               <w:rPr>
                 <w:rFonts w:ascii="Consolas" w:hAnsi="Consolas"/>
-                <w:b/>
-                <w:color w:val="42474A"/>
-                <w:sz w:val="21"/>
+                <w:lang w:val="pt-BR"/>
               </w:rPr>
             </w:pPr>
             <w:r>
@@ -464,27 +665,41 @@
                 <w:b/>
                 <w:color w:val="42474A"/>
                 <w:sz w:val="21"/>
+                <w:lang w:val="pt-BR"/>
               </w:rPr>
               <w:t xml:space="preserve">CONTEÚDO PROGRAMÁTICO: </w:t>
             </w:r>
-          </w:p>
-          <w:p>
-            <w:pPr>
-              <w:rPr>
-                <w:rFonts w:ascii="Consolas" w:hAnsi="Consolas"/>
-              </w:rPr>
-            </w:pPr>
             <w:r>
               <w:rPr>
                 <w:rFonts w:ascii="Consolas" w:hAnsi="Consolas"/>
                 <w:color w:val="42474A"/>
                 <w:sz w:val="21"/>
+                <w:lang w:val="pt-BR"/>
               </w:rPr>
               <w:t>{{CONTEUDO_PROGRAMATICO}}</w:t>
             </w:r>
           </w:p>
         </w:tc>
       </w:tr>
+    </w:tbl>
+    <w:p>
+      <w:pPr>
+        <w:spacing w:after="0" w:line="20" w:lineRule="exact"/>
+        <w:rPr>
+          <w:rFonts w:ascii="Consolas" w:hAnsi="Consolas"/>
+          <w:lang w:val="pt-BR"/>
+        </w:rPr>
+      </w:pPr>
+    </w:p>
+    <w:tbl>
+      <w:tblPr>
+        <w:tblStyle w:val="Tabelacomgrade"/>
+        <w:tblW w:w="0" w:type="auto"/>
+        <w:tblLook w:val="04A0" w:firstRow="1" w:lastRow="0" w:firstColumn="1" w:lastColumn="0" w:noHBand="0" w:noVBand="1"/>
+      </w:tblPr>
+      <w:tblGrid>
+        <w:gridCol w:w="10466"/>
+      </w:tblGrid>
       <w:tr>
         <w:tc>
           <w:tcPr>
@@ -494,9 +709,7 @@
             <w:pPr>
               <w:rPr>
                 <w:rFonts w:ascii="Consolas" w:hAnsi="Consolas"/>
-                <w:b/>
-                <w:color w:val="42474A"/>
-                <w:sz w:val="21"/>
+                <w:lang w:val="pt-BR"/>
               </w:rPr>
             </w:pPr>
             <w:r>
@@ -505,27 +718,41 @@
                 <w:b/>
                 <w:color w:val="42474A"/>
                 <w:sz w:val="21"/>
+                <w:lang w:val="pt-BR"/>
               </w:rPr>
               <w:t xml:space="preserve">PROCEDIMENTOS: </w:t>
             </w:r>
-          </w:p>
-          <w:p>
-            <w:pPr>
-              <w:rPr>
-                <w:rFonts w:ascii="Consolas" w:hAnsi="Consolas"/>
-              </w:rPr>
-            </w:pPr>
             <w:r>
               <w:rPr>
                 <w:rFonts w:ascii="Consolas" w:hAnsi="Consolas"/>
                 <w:color w:val="42474A"/>
                 <w:sz w:val="21"/>
+                <w:lang w:val="pt-BR"/>
               </w:rPr>
               <w:t>{{PROCEDIMENTOS}}</w:t>
             </w:r>
           </w:p>
         </w:tc>
       </w:tr>
+    </w:tbl>
+    <w:p>
+      <w:pPr>
+        <w:spacing w:after="0" w:line="20" w:lineRule="exact"/>
+        <w:rPr>
+          <w:rFonts w:ascii="Consolas" w:hAnsi="Consolas"/>
+          <w:lang w:val="pt-BR"/>
+        </w:rPr>
+      </w:pPr>
+    </w:p>
+    <w:tbl>
+      <w:tblPr>
+        <w:tblStyle w:val="Tabelacomgrade"/>
+        <w:tblW w:w="0" w:type="auto"/>
+        <w:tblLook w:val="04A0" w:firstRow="1" w:lastRow="0" w:firstColumn="1" w:lastColumn="0" w:noHBand="0" w:noVBand="1"/>
+      </w:tblPr>
+      <w:tblGrid>
+        <w:gridCol w:w="10466"/>
+      </w:tblGrid>
       <w:tr>
         <w:tc>
           <w:tcPr>
@@ -535,9 +762,7 @@
             <w:pPr>
               <w:rPr>
                 <w:rFonts w:ascii="Consolas" w:hAnsi="Consolas"/>
-                <w:b/>
-                <w:color w:val="42474A"/>
-                <w:sz w:val="21"/>
+                <w:lang w:val="pt-BR"/>
               </w:rPr>
             </w:pPr>
             <w:r>
@@ -546,27 +771,41 @@
                 <w:b/>
                 <w:color w:val="42474A"/>
                 <w:sz w:val="21"/>
+                <w:lang w:val="pt-BR"/>
               </w:rPr>
               <w:t xml:space="preserve">ATIVIDADE OBRIGATÓRIA: </w:t>
             </w:r>
-          </w:p>
-          <w:p>
-            <w:pPr>
-              <w:rPr>
-                <w:rFonts w:ascii="Consolas" w:hAnsi="Consolas"/>
-              </w:rPr>
-            </w:pPr>
             <w:r>
               <w:rPr>
                 <w:rFonts w:ascii="Consolas" w:hAnsi="Consolas"/>
                 <w:color w:val="42474A"/>
                 <w:sz w:val="21"/>
+                <w:lang w:val="pt-BR"/>
               </w:rPr>
               <w:t>{{ATIVIDADE_OBRIGATÓRIA}}</w:t>
             </w:r>
           </w:p>
         </w:tc>
       </w:tr>
+    </w:tbl>
+    <w:p>
+      <w:pPr>
+        <w:spacing w:after="0" w:line="20" w:lineRule="exact"/>
+        <w:rPr>
+          <w:rFonts w:ascii="Consolas" w:hAnsi="Consolas"/>
+          <w:lang w:val="pt-BR"/>
+        </w:rPr>
+      </w:pPr>
+    </w:p>
+    <w:tbl>
+      <w:tblPr>
+        <w:tblStyle w:val="Tabelacomgrade"/>
+        <w:tblW w:w="0" w:type="auto"/>
+        <w:tblLook w:val="04A0" w:firstRow="1" w:lastRow="0" w:firstColumn="1" w:lastColumn="0" w:noHBand="0" w:noVBand="1"/>
+      </w:tblPr>
+      <w:tblGrid>
+        <w:gridCol w:w="10466"/>
+      </w:tblGrid>
       <w:tr>
         <w:tc>
           <w:tcPr>
@@ -576,6 +815,7 @@
             <w:pPr>
               <w:rPr>
                 <w:rFonts w:ascii="Consolas" w:hAnsi="Consolas"/>
+                <w:lang w:val="pt-BR"/>
               </w:rPr>
             </w:pPr>
             <w:r>
@@ -584,6 +824,7 @@
                 <w:b/>
                 <w:color w:val="42474A"/>
                 <w:sz w:val="21"/>
+                <w:lang w:val="pt-BR"/>
               </w:rPr>
               <w:t xml:space="preserve">CRONOGRAMA: </w:t>
             </w:r>
@@ -592,12 +833,32 @@
                 <w:rFonts w:ascii="Consolas" w:hAnsi="Consolas"/>
                 <w:color w:val="42474A"/>
                 <w:sz w:val="21"/>
+                <w:lang w:val="pt-BR"/>
               </w:rPr>
               <w:t>{{CRONOGRAMA}}</w:t>
             </w:r>
           </w:p>
         </w:tc>
       </w:tr>
+    </w:tbl>
+    <w:p>
+      <w:pPr>
+        <w:spacing w:after="0" w:line="20" w:lineRule="exact"/>
+        <w:rPr>
+          <w:rFonts w:ascii="Consolas" w:hAnsi="Consolas"/>
+          <w:lang w:val="pt-BR"/>
+        </w:rPr>
+      </w:pPr>
+    </w:p>
+    <w:tbl>
+      <w:tblPr>
+        <w:tblStyle w:val="Tabelacomgrade"/>
+        <w:tblW w:w="0" w:type="auto"/>
+        <w:tblLook w:val="04A0" w:firstRow="1" w:lastRow="0" w:firstColumn="1" w:lastColumn="0" w:noHBand="0" w:noVBand="1"/>
+      </w:tblPr>
+      <w:tblGrid>
+        <w:gridCol w:w="10466"/>
+      </w:tblGrid>
       <w:tr>
         <w:tc>
           <w:tcPr>
@@ -632,6 +893,25 @@
           </w:p>
         </w:tc>
       </w:tr>
+    </w:tbl>
+    <w:p>
+      <w:pPr>
+        <w:spacing w:after="0" w:line="20" w:lineRule="exact"/>
+        <w:rPr>
+          <w:rFonts w:ascii="Consolas" w:hAnsi="Consolas"/>
+          <w:lang w:val="pt-BR"/>
+        </w:rPr>
+      </w:pPr>
+    </w:p>
+    <w:tbl>
+      <w:tblPr>
+        <w:tblStyle w:val="Tabelacomgrade"/>
+        <w:tblW w:w="0" w:type="auto"/>
+        <w:tblLook w:val="04A0" w:firstRow="1" w:lastRow="0" w:firstColumn="1" w:lastColumn="0" w:noHBand="0" w:noVBand="1"/>
+      </w:tblPr>
+      <w:tblGrid>
+        <w:gridCol w:w="10466"/>
+      </w:tblGrid>
       <w:tr>
         <w:tc>
           <w:tcPr>
@@ -641,9 +921,7 @@
             <w:pPr>
               <w:rPr>
                 <w:rFonts w:ascii="Consolas" w:hAnsi="Consolas"/>
-                <w:b/>
-                <w:color w:val="42474A"/>
-                <w:sz w:val="21"/>
+                <w:lang w:val="pt-BR"/>
               </w:rPr>
             </w:pPr>
             <w:r>
@@ -652,27 +930,41 @@
                 <w:b/>
                 <w:color w:val="42474A"/>
                 <w:sz w:val="21"/>
+                <w:lang w:val="pt-BR"/>
               </w:rPr>
               <w:t xml:space="preserve">BIBLIOGRAFIA: </w:t>
             </w:r>
-          </w:p>
-          <w:p>
-            <w:pPr>
-              <w:rPr>
-                <w:rFonts w:ascii="Consolas" w:hAnsi="Consolas"/>
-              </w:rPr>
-            </w:pPr>
             <w:r>
               <w:rPr>
                 <w:rFonts w:ascii="Consolas" w:hAnsi="Consolas"/>
                 <w:color w:val="42474A"/>
                 <w:sz w:val="21"/>
+                <w:lang w:val="pt-BR"/>
               </w:rPr>
               <w:t>{{BIBLIOGRAFIA}}</w:t>
             </w:r>
           </w:p>
         </w:tc>
       </w:tr>
+    </w:tbl>
+    <w:p>
+      <w:pPr>
+        <w:spacing w:after="0" w:line="20" w:lineRule="exact"/>
+        <w:rPr>
+          <w:rFonts w:ascii="Consolas" w:hAnsi="Consolas"/>
+          <w:lang w:val="pt-BR"/>
+        </w:rPr>
+      </w:pPr>
+    </w:p>
+    <w:tbl>
+      <w:tblPr>
+        <w:tblStyle w:val="Tabelacomgrade"/>
+        <w:tblW w:w="0" w:type="auto"/>
+        <w:tblLook w:val="04A0" w:firstRow="1" w:lastRow="0" w:firstColumn="1" w:lastColumn="0" w:noHBand="0" w:noVBand="1"/>
+      </w:tblPr>
+      <w:tblGrid>
+        <w:gridCol w:w="10466"/>
+      </w:tblGrid>
       <w:tr>
         <w:tc>
           <w:tcPr>
@@ -707,6 +999,25 @@
           </w:p>
         </w:tc>
       </w:tr>
+    </w:tbl>
+    <w:p>
+      <w:pPr>
+        <w:spacing w:after="0" w:line="20" w:lineRule="exact"/>
+        <w:rPr>
+          <w:rFonts w:ascii="Consolas" w:hAnsi="Consolas"/>
+          <w:lang w:val="pt-BR"/>
+        </w:rPr>
+      </w:pPr>
+    </w:p>
+    <w:tbl>
+      <w:tblPr>
+        <w:tblStyle w:val="Tabelacomgrade"/>
+        <w:tblW w:w="0" w:type="auto"/>
+        <w:tblLook w:val="04A0" w:firstRow="1" w:lastRow="0" w:firstColumn="1" w:lastColumn="0" w:noHBand="0" w:noVBand="1"/>
+      </w:tblPr>
+      <w:tblGrid>
+        <w:gridCol w:w="10466"/>
+      </w:tblGrid>
       <w:tr>
         <w:tc>
           <w:tcPr>
@@ -741,6 +1052,25 @@
           </w:p>
         </w:tc>
       </w:tr>
+    </w:tbl>
+    <w:p>
+      <w:pPr>
+        <w:spacing w:after="0" w:line="20" w:lineRule="exact"/>
+        <w:rPr>
+          <w:rFonts w:ascii="Consolas" w:hAnsi="Consolas"/>
+          <w:lang w:val="pt-BR"/>
+        </w:rPr>
+      </w:pPr>
+    </w:p>
+    <w:tbl>
+      <w:tblPr>
+        <w:tblStyle w:val="Tabelacomgrade"/>
+        <w:tblW w:w="0" w:type="auto"/>
+        <w:tblLook w:val="04A0" w:firstRow="1" w:lastRow="0" w:firstColumn="1" w:lastColumn="0" w:noHBand="0" w:noVBand="1"/>
+      </w:tblPr>
+      <w:tblGrid>
+        <w:gridCol w:w="10466"/>
+      </w:tblGrid>
       <w:tr>
         <w:tc>
           <w:tcPr>
@@ -775,6 +1105,25 @@
           </w:p>
         </w:tc>
       </w:tr>
+    </w:tbl>
+    <w:p>
+      <w:pPr>
+        <w:spacing w:after="0" w:line="20" w:lineRule="exact"/>
+        <w:rPr>
+          <w:rFonts w:ascii="Consolas" w:hAnsi="Consolas"/>
+          <w:lang w:val="pt-BR"/>
+        </w:rPr>
+      </w:pPr>
+    </w:p>
+    <w:tbl>
+      <w:tblPr>
+        <w:tblStyle w:val="Tabelacomgrade"/>
+        <w:tblW w:w="0" w:type="auto"/>
+        <w:tblLook w:val="04A0" w:firstRow="1" w:lastRow="0" w:firstColumn="1" w:lastColumn="0" w:noHBand="0" w:noVBand="1"/>
+      </w:tblPr>
+      <w:tblGrid>
+        <w:gridCol w:w="10466"/>
+      </w:tblGrid>
       <w:tr>
         <w:tc>
           <w:tcPr>
@@ -784,9 +1133,7 @@
             <w:pPr>
               <w:rPr>
                 <w:rFonts w:ascii="Consolas" w:hAnsi="Consolas"/>
-                <w:b/>
-                <w:color w:val="42474A"/>
-                <w:sz w:val="21"/>
+                <w:lang w:val="pt-BR"/>
               </w:rPr>
             </w:pPr>
             <w:r>
@@ -795,27 +1142,41 @@
                 <w:b/>
                 <w:color w:val="42474A"/>
                 <w:sz w:val="21"/>
+                <w:lang w:val="pt-BR"/>
               </w:rPr>
               <w:t xml:space="preserve">PÚBLICO ALVO: </w:t>
             </w:r>
-          </w:p>
-          <w:p>
-            <w:pPr>
-              <w:rPr>
-                <w:rFonts w:ascii="Consolas" w:hAnsi="Consolas"/>
-              </w:rPr>
-            </w:pPr>
             <w:r>
               <w:rPr>
                 <w:rFonts w:ascii="Consolas" w:hAnsi="Consolas"/>
                 <w:color w:val="42474A"/>
                 <w:sz w:val="21"/>
+                <w:lang w:val="pt-BR"/>
               </w:rPr>
               <w:t>{{PUBLICO_ALVO}}</w:t>
             </w:r>
           </w:p>
         </w:tc>
       </w:tr>
+    </w:tbl>
+    <w:p>
+      <w:pPr>
+        <w:spacing w:after="0" w:line="20" w:lineRule="exact"/>
+        <w:rPr>
+          <w:rFonts w:ascii="Consolas" w:hAnsi="Consolas"/>
+          <w:lang w:val="pt-BR"/>
+        </w:rPr>
+      </w:pPr>
+    </w:p>
+    <w:tbl>
+      <w:tblPr>
+        <w:tblStyle w:val="Tabelacomgrade"/>
+        <w:tblW w:w="0" w:type="auto"/>
+        <w:tblLook w:val="04A0" w:firstRow="1" w:lastRow="0" w:firstColumn="1" w:lastColumn="0" w:noHBand="0" w:noVBand="1"/>
+      </w:tblPr>
+      <w:tblGrid>
+        <w:gridCol w:w="10466"/>
+      </w:tblGrid>
       <w:tr>
         <w:tc>
           <w:tcPr>
@@ -825,9 +1186,7 @@
             <w:pPr>
               <w:rPr>
                 <w:rFonts w:ascii="Consolas" w:hAnsi="Consolas"/>
-                <w:b/>
-                <w:color w:val="42474A"/>
-                <w:sz w:val="21"/>
+                <w:lang w:val="pt-BR"/>
               </w:rPr>
             </w:pPr>
             <w:r>
@@ -836,27 +1195,41 @@
                 <w:b/>
                 <w:color w:val="42474A"/>
                 <w:sz w:val="21"/>
+                <w:lang w:val="pt-BR"/>
               </w:rPr>
               <w:t xml:space="preserve">FUNÇÃO ESPECÍFICA: </w:t>
             </w:r>
-          </w:p>
-          <w:p>
-            <w:pPr>
-              <w:rPr>
-                <w:rFonts w:ascii="Consolas" w:hAnsi="Consolas"/>
-              </w:rPr>
-            </w:pPr>
             <w:r>
               <w:rPr>
                 <w:rFonts w:ascii="Consolas" w:hAnsi="Consolas"/>
                 <w:color w:val="42474A"/>
                 <w:sz w:val="21"/>
+                <w:lang w:val="pt-BR"/>
               </w:rPr>
               <w:t>{{FUNCAO_ESPECIFICA}}</w:t>
             </w:r>
           </w:p>
         </w:tc>
       </w:tr>
+    </w:tbl>
+    <w:p>
+      <w:pPr>
+        <w:spacing w:after="0" w:line="20" w:lineRule="exact"/>
+        <w:rPr>
+          <w:rFonts w:ascii="Consolas" w:hAnsi="Consolas"/>
+          <w:lang w:val="pt-BR"/>
+        </w:rPr>
+      </w:pPr>
+    </w:p>
+    <w:tbl>
+      <w:tblPr>
+        <w:tblStyle w:val="Tabelacomgrade"/>
+        <w:tblW w:w="0" w:type="auto"/>
+        <w:tblLook w:val="04A0" w:firstRow="1" w:lastRow="0" w:firstColumn="1" w:lastColumn="0" w:noHBand="0" w:noVBand="1"/>
+      </w:tblPr>
+      <w:tblGrid>
+        <w:gridCol w:w="10466"/>
+      </w:tblGrid>
       <w:tr>
         <w:tc>
           <w:tcPr>
@@ -866,9 +1239,6 @@
             <w:pPr>
               <w:rPr>
                 <w:rFonts w:ascii="Consolas" w:hAnsi="Consolas"/>
-                <w:b/>
-                <w:color w:val="42474A"/>
-                <w:sz w:val="21"/>
                 <w:lang w:val="pt-BR"/>
               </w:rPr>
             </w:pPr>
@@ -882,14 +1252,6 @@
               </w:rPr>
               <w:t xml:space="preserve">HAVENDO VAGAS REMANESCENTES, PODERÃO SER CONTEMPLADOS OS SEGUINTES CARGOS COMO PÚBLICO ALVO: </w:t>
             </w:r>
-          </w:p>
-          <w:p>
-            <w:pPr>
-              <w:rPr>
-                <w:rFonts w:ascii="Consolas" w:hAnsi="Consolas"/>
-                <w:lang w:val="pt-BR"/>
-              </w:rPr>
-            </w:pPr>
             <w:r>
               <w:rPr>
                 <w:rFonts w:ascii="Consolas" w:hAnsi="Consolas"/>
@@ -902,6 +1264,25 @@
           </w:p>
         </w:tc>
       </w:tr>
+    </w:tbl>
+    <w:p>
+      <w:pPr>
+        <w:spacing w:after="0" w:line="20" w:lineRule="exact"/>
+        <w:rPr>
+          <w:rFonts w:ascii="Consolas" w:hAnsi="Consolas"/>
+          <w:lang w:val="pt-BR"/>
+        </w:rPr>
+      </w:pPr>
+    </w:p>
+    <w:tbl>
+      <w:tblPr>
+        <w:tblStyle w:val="Tabelacomgrade"/>
+        <w:tblW w:w="0" w:type="auto"/>
+        <w:tblLook w:val="04A0" w:firstRow="1" w:lastRow="0" w:firstColumn="1" w:lastColumn="0" w:noHBand="0" w:noVBand="1"/>
+      </w:tblPr>
+      <w:tblGrid>
+        <w:gridCol w:w="10466"/>
+      </w:tblGrid>
       <w:tr>
         <w:tc>
           <w:tcPr>
@@ -911,9 +1292,7 @@
             <w:pPr>
               <w:rPr>
                 <w:rFonts w:ascii="Consolas" w:hAnsi="Consolas"/>
-                <w:b/>
-                <w:color w:val="42474A"/>
-                <w:sz w:val="21"/>
+                <w:lang w:val="pt-BR"/>
               </w:rPr>
             </w:pPr>
             <w:r>
@@ -922,27 +1301,41 @@
                 <w:b/>
                 <w:color w:val="42474A"/>
                 <w:sz w:val="21"/>
+                <w:lang w:val="pt-BR"/>
               </w:rPr>
               <w:t xml:space="preserve">CORPO DOCENTE: </w:t>
             </w:r>
-          </w:p>
-          <w:p>
-            <w:pPr>
-              <w:rPr>
-                <w:rFonts w:ascii="Consolas" w:hAnsi="Consolas"/>
-              </w:rPr>
-            </w:pPr>
             <w:r>
               <w:rPr>
                 <w:rFonts w:ascii="Consolas" w:hAnsi="Consolas"/>
                 <w:color w:val="42474A"/>
                 <w:sz w:val="21"/>
+                <w:lang w:val="pt-BR"/>
               </w:rPr>
               <w:t>{{CORPO_DOCENTE}}</w:t>
             </w:r>
           </w:p>
         </w:tc>
       </w:tr>
+    </w:tbl>
+    <w:p>
+      <w:pPr>
+        <w:spacing w:after="0" w:line="20" w:lineRule="exact"/>
+        <w:rPr>
+          <w:rFonts w:ascii="Consolas" w:hAnsi="Consolas"/>
+          <w:lang w:val="pt-BR"/>
+        </w:rPr>
+      </w:pPr>
+    </w:p>
+    <w:tbl>
+      <w:tblPr>
+        <w:tblStyle w:val="Tabelacomgrade"/>
+        <w:tblW w:w="0" w:type="auto"/>
+        <w:tblLook w:val="04A0" w:firstRow="1" w:lastRow="0" w:firstColumn="1" w:lastColumn="0" w:noHBand="0" w:noVBand="1"/>
+      </w:tblPr>
+      <w:tblGrid>
+        <w:gridCol w:w="10466"/>
+      </w:tblGrid>
       <w:tr>
         <w:tc>
           <w:tcPr>
@@ -952,9 +1345,6 @@
             <w:pPr>
               <w:rPr>
                 <w:rFonts w:ascii="Consolas" w:hAnsi="Consolas"/>
-                <w:b/>
-                <w:color w:val="42474A"/>
-                <w:sz w:val="21"/>
                 <w:lang w:val="pt-BR"/>
               </w:rPr>
             </w:pPr>
@@ -968,14 +1358,6 @@
               </w:rPr>
               <w:t xml:space="preserve">INSCRIÇÕES (PROCEDIMENTOS E PERÍODO): </w:t>
             </w:r>
-          </w:p>
-          <w:p>
-            <w:pPr>
-              <w:rPr>
-                <w:rFonts w:ascii="Consolas" w:hAnsi="Consolas"/>
-                <w:lang w:val="pt-BR"/>
-              </w:rPr>
-            </w:pPr>
             <w:r>
               <w:rPr>
                 <w:rFonts w:ascii="Consolas" w:hAnsi="Consolas"/>
@@ -988,6 +1370,25 @@
           </w:p>
         </w:tc>
       </w:tr>
+    </w:tbl>
+    <w:p>
+      <w:pPr>
+        <w:spacing w:after="0" w:line="20" w:lineRule="exact"/>
+        <w:rPr>
+          <w:rFonts w:ascii="Consolas" w:hAnsi="Consolas"/>
+          <w:lang w:val="pt-BR"/>
+        </w:rPr>
+      </w:pPr>
+    </w:p>
+    <w:tbl>
+      <w:tblPr>
+        <w:tblStyle w:val="Tabelacomgrade"/>
+        <w:tblW w:w="0" w:type="auto"/>
+        <w:tblLook w:val="04A0" w:firstRow="1" w:lastRow="0" w:firstColumn="1" w:lastColumn="0" w:noHBand="0" w:noVBand="1"/>
+      </w:tblPr>
+      <w:tblGrid>
+        <w:gridCol w:w="10466"/>
+      </w:tblGrid>
       <w:tr>
         <w:tc>
           <w:tcPr>
@@ -997,9 +1398,6 @@
             <w:pPr>
               <w:rPr>
                 <w:rFonts w:ascii="Consolas" w:hAnsi="Consolas"/>
-                <w:b/>
-                <w:color w:val="42474A"/>
-                <w:sz w:val="21"/>
                 <w:lang w:val="pt-BR"/>
               </w:rPr>
             </w:pPr>
@@ -1013,14 +1411,6 @@
               </w:rPr>
               <w:t xml:space="preserve">CONTATO COM A ÁREA RESPONSÁVEL: </w:t>
             </w:r>
-          </w:p>
-          <w:p>
-            <w:pPr>
-              <w:rPr>
-                <w:rFonts w:ascii="Consolas" w:hAnsi="Consolas"/>
-                <w:lang w:val="pt-BR"/>
-              </w:rPr>
-            </w:pPr>
             <w:r>
               <w:rPr>
                 <w:rFonts w:ascii="Consolas" w:hAnsi="Consolas"/>
@@ -1036,6 +1426,7 @@
     </w:tbl>
     <w:p>
       <w:pPr>
+        <w:spacing w:after="0" w:line="20" w:lineRule="exact"/>
         <w:rPr>
           <w:rFonts w:ascii="Consolas" w:hAnsi="Consolas"/>
           <w:lang w:val="pt-BR"/>
@@ -1120,13 +1511,10 @@
         <w:p>
           <w:pPr>
             <w:jc w:val="right"/>
-            <w:rPr>
-              <w:rFonts w:ascii="Consolas" w:hAnsi="Consolas"/>
-            </w:rPr>
           </w:pPr>
           <w:r>
             <w:rPr>
-              <w:rFonts w:ascii="Consolas" w:hAnsi="Consolas"/>
+              <w:rFonts w:ascii="Courier New" w:hAnsi="Courier New"/>
               <w:color w:val="42474A"/>
               <w:sz w:val="20"/>
             </w:rPr>
@@ -1134,7 +1522,7 @@
           </w:r>
           <w:r>
             <w:rPr>
-              <w:rFonts w:ascii="Consolas" w:hAnsi="Consolas"/>
+              <w:rFonts w:ascii="Courier New" w:hAnsi="Courier New"/>
               <w:color w:val="42474A"/>
               <w:sz w:val="20"/>
             </w:rPr>
@@ -1142,7 +1530,7 @@
           </w:r>
           <w:r>
             <w:rPr>
-              <w:rFonts w:ascii="Consolas" w:hAnsi="Consolas"/>
+              <w:rFonts w:ascii="Courier New" w:hAnsi="Courier New"/>
               <w:color w:val="42474A"/>
               <w:sz w:val="20"/>
             </w:rPr>
@@ -1150,7 +1538,7 @@
           </w:r>
           <w:r>
             <w:rPr>
-              <w:rFonts w:ascii="Consolas" w:hAnsi="Consolas"/>
+              <w:rFonts w:ascii="Courier New" w:hAnsi="Courier New"/>
               <w:color w:val="42474A"/>
               <w:sz w:val="20"/>
             </w:rPr>
@@ -1158,7 +1546,7 @@
           </w:r>
           <w:r>
             <w:rPr>
-              <w:rFonts w:ascii="Consolas" w:hAnsi="Consolas"/>
+              <w:rFonts w:ascii="Courier New" w:hAnsi="Courier New"/>
               <w:color w:val="42474A"/>
               <w:sz w:val="20"/>
             </w:rPr>
@@ -1166,7 +1554,7 @@
           </w:r>
           <w:r>
             <w:rPr>
-              <w:rFonts w:ascii="Consolas" w:hAnsi="Consolas"/>
+              <w:rFonts w:ascii="Courier New" w:hAnsi="Courier New"/>
               <w:color w:val="42474A"/>
               <w:sz w:val="20"/>
             </w:rPr>
@@ -1174,7 +1562,7 @@
           </w:r>
           <w:r>
             <w:rPr>
-              <w:rFonts w:ascii="Consolas" w:hAnsi="Consolas"/>
+              <w:rFonts w:ascii="Courier New" w:hAnsi="Courier New"/>
               <w:color w:val="42474A"/>
               <w:sz w:val="20"/>
             </w:rPr>
@@ -1182,7 +1570,7 @@
           </w:r>
           <w:r>
             <w:rPr>
-              <w:rFonts w:ascii="Consolas" w:hAnsi="Consolas"/>
+              <w:rFonts w:ascii="Courier New" w:hAnsi="Courier New"/>
               <w:color w:val="42474A"/>
               <w:sz w:val="20"/>
             </w:rPr>
@@ -1190,7 +1578,7 @@
           </w:r>
           <w:r>
             <w:rPr>
-              <w:rFonts w:ascii="Consolas" w:hAnsi="Consolas"/>
+              <w:rFonts w:ascii="Courier New" w:hAnsi="Courier New"/>
               <w:color w:val="42474A"/>
               <w:sz w:val="20"/>
             </w:rPr>
@@ -1198,7 +1586,7 @@
           </w:r>
           <w:r>
             <w:rPr>
-              <w:rFonts w:ascii="Consolas" w:hAnsi="Consolas"/>
+              <w:rFonts w:ascii="Courier New" w:hAnsi="Courier New"/>
               <w:color w:val="42474A"/>
               <w:sz w:val="20"/>
             </w:rPr>
@@ -1206,7 +1594,7 @@
           </w:r>
           <w:r>
             <w:rPr>
-              <w:rFonts w:ascii="Consolas" w:hAnsi="Consolas"/>
+              <w:rFonts w:ascii="Courier New" w:hAnsi="Courier New"/>
               <w:color w:val="42474A"/>
               <w:sz w:val="20"/>
             </w:rPr>
@@ -1476,31 +1864,31 @@
       </w:rPr>
     </w:lvl>
   </w:abstractNum>
-  <w:num w:numId="1" w16cid:durableId="427314621">
+  <w:num w:numId="1" w16cid:durableId="727997515">
     <w:abstractNumId w:val="8"/>
   </w:num>
-  <w:num w:numId="2" w16cid:durableId="1077439843">
+  <w:num w:numId="2" w16cid:durableId="1476987773">
     <w:abstractNumId w:val="6"/>
   </w:num>
-  <w:num w:numId="3" w16cid:durableId="2140688413">
+  <w:num w:numId="3" w16cid:durableId="214855164">
     <w:abstractNumId w:val="5"/>
   </w:num>
-  <w:num w:numId="4" w16cid:durableId="1621836082">
+  <w:num w:numId="4" w16cid:durableId="1391925039">
     <w:abstractNumId w:val="4"/>
   </w:num>
-  <w:num w:numId="5" w16cid:durableId="1205827813">
+  <w:num w:numId="5" w16cid:durableId="88351266">
     <w:abstractNumId w:val="7"/>
   </w:num>
-  <w:num w:numId="6" w16cid:durableId="905265694">
+  <w:num w:numId="6" w16cid:durableId="1064643456">
     <w:abstractNumId w:val="3"/>
   </w:num>
-  <w:num w:numId="7" w16cid:durableId="1125124274">
+  <w:num w:numId="7" w16cid:durableId="388578109">
     <w:abstractNumId w:val="2"/>
   </w:num>
-  <w:num w:numId="8" w16cid:durableId="1306427245">
+  <w:num w:numId="8" w16cid:durableId="1053697674">
     <w:abstractNumId w:val="1"/>
   </w:num>
-  <w:num w:numId="9" w16cid:durableId="1579514992">
+  <w:num w:numId="9" w16cid:durableId="1397046229">
     <w:abstractNumId w:val="0"/>
   </w:num>
 </w:numbering>

</xml_diff>